<commit_message>
Create FEE doc and add it to Desenvolvimento
</commit_message>
<xml_diff>
--- a/work 2024/Desenvolvimento.docx
+++ b/work 2024/Desenvolvimento.docx
@@ -507,17 +507,7 @@
           <w:sz w:val="24"/>
           <w:szCs w:val="24"/>
         </w:rPr>
-        <w:t>s de interesse a intervalos regulares,</w:t>
-      </w:r>
-      <w:bookmarkStart w:id="1" w:name="_GoBack"/>
-      <w:bookmarkEnd w:id="1"/>
-      <w:r>
-        <w:rPr>
-          <w:rFonts w:ascii="Times New Roman" w:hAnsi="Times New Roman" w:cs="Times New Roman"/>
-          <w:sz w:val="24"/>
-          <w:szCs w:val="24"/>
-        </w:rPr>
-        <w:t xml:space="preserve"> sendo elaborado um dataframe que é gravado no microSD e enviado para um servidor no CBPF em tempo real, via módulo Ethernet. </w:t>
+        <w:t xml:space="preserve">s de interesse a intervalos regulares, sendo elaborado um dataframe que é gravado no microSD e enviado para um servidor no CBPF em tempo real, via módulo Ethernet. </w:t>
       </w:r>
       <w:r>
         <w:rPr>
@@ -1771,16 +1761,6 @@
         <w:jc w:val="center"/>
         <w:rPr>
           <w:rFonts w:hint="default" w:ascii="Times New Roman" w:hAnsi="Times New Roman" w:cs="Times New Roman"/>
-          <w:b/>
-          <w:bCs/>
-          <w:sz w:val="36"/>
-          <w:szCs w:val="36"/>
-          <w:lang w:val="pt-BR"/>
-        </w:rPr>
-      </w:pPr>
-      <w:r>
-        <w:rPr>
-          <w:rFonts w:hint="default" w:ascii="Times New Roman" w:hAnsi="Times New Roman" w:cs="Times New Roman"/>
           <w:b w:val="0"/>
           <w:i w:val="0"/>
           <w:sz w:val="24"/>
@@ -1788,8 +1768,36 @@
           <w:vertAlign w:val="baseline"/>
           <w:lang w:val="pt-BR" w:eastAsia="en-US" w:bidi="ar-SA"/>
         </w:rPr>
+      </w:pPr>
+      <w:r>
+        <w:rPr>
+          <w:rFonts w:hint="default" w:ascii="Times New Roman" w:hAnsi="Times New Roman" w:cs="Times New Roman"/>
+          <w:b w:val="0"/>
+          <w:i w:val="0"/>
+          <w:sz w:val="24"/>
+          <w:szCs w:val="24"/>
+          <w:vertAlign w:val="baseline"/>
+          <w:lang w:val="pt-BR" w:eastAsia="en-US" w:bidi="ar-SA"/>
+        </w:rPr>
         <w:t>Figura: Circuito da fonte de tensão de polarização da SiPM.</w:t>
       </w:r>
+    </w:p>
+    <w:p>
+      <w:pPr>
+        <w:spacing w:line="360" w:lineRule="auto"/>
+        <w:jc w:val="center"/>
+        <w:rPr>
+          <w:rFonts w:hint="default" w:ascii="Times New Roman" w:hAnsi="Times New Roman" w:cs="Times New Roman"/>
+          <w:b w:val="0"/>
+          <w:i w:val="0"/>
+          <w:sz w:val="24"/>
+          <w:szCs w:val="24"/>
+          <w:vertAlign w:val="baseline"/>
+          <w:lang w:val="pt-BR" w:eastAsia="en-US" w:bidi="ar-SA"/>
+        </w:rPr>
+      </w:pPr>
+      <w:bookmarkStart w:id="1" w:name="_GoBack"/>
+      <w:bookmarkEnd w:id="1"/>
     </w:p>
     <w:p>
       <w:pPr>
@@ -1823,10 +1831,8 @@
         <w:spacing w:line="360" w:lineRule="auto"/>
         <w:rPr>
           <w:rFonts w:hint="default" w:ascii="Times New Roman" w:hAnsi="Times New Roman" w:cs="Times New Roman"/>
-          <w:b/>
-          <w:bCs/>
-          <w:sz w:val="36"/>
-          <w:szCs w:val="36"/>
+          <w:sz w:val="24"/>
+          <w:szCs w:val="24"/>
           <w:lang w:val="pt-BR"/>
         </w:rPr>
       </w:pPr>
@@ -1848,7 +1854,134 @@
           <w:szCs w:val="24"/>
           <w:lang w:val="pt-BR"/>
         </w:rPr>
-        <w:t>O microcontrolador é responsável pela aquisição</w:t>
+        <w:t>A amplitude e largura dos pulsos advindos da SiPM são muito pequenos para detecção pelas portas de entrada do FPGA. Para isso, o circuito de Front-End (FEE) é responsável por amplificar, alongar esse sinal. Além disso, para diferenciar o pulso proveniente da detecção de uma partícula de sinais de ruído, que podem ser de origem térmica, da fonte de alimentação ou de interferência externa, a saída do circuito amplificador passa por um discriminador, cuja saída é então alimentada no módulo contador. Segue abaixo o esquemático do circuito:</w:t>
+      </w:r>
+    </w:p>
+    <w:p>
+      <w:pPr>
+        <w:spacing w:line="360" w:lineRule="auto"/>
+      </w:pPr>
+      <w:r>
+        <w:drawing>
+          <wp:inline distT="0" distB="0" distL="114300" distR="114300">
+            <wp:extent cx="5272405" cy="3193415"/>
+            <wp:effectExtent l="0" t="0" r="4445" b="6985"/>
+            <wp:docPr id="4" name="Imagem 4"/>
+            <wp:cNvGraphicFramePr>
+              <a:graphicFrameLocks xmlns:a="http://schemas.openxmlformats.org/drawingml/2006/main" noChangeAspect="1"/>
+            </wp:cNvGraphicFramePr>
+            <a:graphic xmlns:a="http://schemas.openxmlformats.org/drawingml/2006/main">
+              <a:graphicData uri="http://schemas.openxmlformats.org/drawingml/2006/picture">
+                <pic:pic xmlns:pic="http://schemas.openxmlformats.org/drawingml/2006/picture">
+                  <pic:nvPicPr>
+                    <pic:cNvPr id="4" name="Imagem 4"/>
+                    <pic:cNvPicPr>
+                      <a:picLocks noChangeAspect="1"/>
+                    </pic:cNvPicPr>
+                  </pic:nvPicPr>
+                  <pic:blipFill>
+                    <a:blip r:embed="rId11"/>
+                    <a:stretch>
+                      <a:fillRect/>
+                    </a:stretch>
+                  </pic:blipFill>
+                  <pic:spPr>
+                    <a:xfrm>
+                      <a:off x="0" y="0"/>
+                      <a:ext cx="5272405" cy="3193415"/>
+                    </a:xfrm>
+                    <a:prstGeom prst="rect">
+                      <a:avLst/>
+                    </a:prstGeom>
+                    <a:noFill/>
+                    <a:ln>
+                      <a:noFill/>
+                    </a:ln>
+                  </pic:spPr>
+                </pic:pic>
+              </a:graphicData>
+            </a:graphic>
+          </wp:inline>
+        </w:drawing>
+      </w:r>
+    </w:p>
+    <w:p>
+      <w:pPr>
+        <w:spacing w:line="360" w:lineRule="auto"/>
+      </w:pPr>
+    </w:p>
+    <w:p>
+      <w:pPr>
+        <w:spacing w:line="360" w:lineRule="auto"/>
+        <w:rPr>
+          <w:rFonts w:hint="default" w:ascii="Times New Roman" w:hAnsi="Times New Roman"/>
+          <w:sz w:val="24"/>
+          <w:szCs w:val="24"/>
+          <w:lang w:val="pt-BR"/>
+        </w:rPr>
+      </w:pPr>
+      <w:r>
+        <w:rPr>
+          <w:rFonts w:hint="default"/>
+          <w:lang w:val="pt-BR"/>
+        </w:rPr>
+        <w:tab/>
+      </w:r>
+      <w:r>
+        <w:rPr>
+          <w:rFonts w:hint="default"/>
+          <w:lang w:val="pt-BR"/>
+        </w:rPr>
+        <w:t>O</w:t>
+      </w:r>
+      <w:r>
+        <w:rPr>
+          <w:rFonts w:hint="default" w:ascii="Times New Roman" w:hAnsi="Times New Roman" w:cs="Times New Roman"/>
+          <w:sz w:val="24"/>
+          <w:szCs w:val="24"/>
+          <w:lang w:val="pt-BR"/>
+        </w:rPr>
+        <w:t xml:space="preserve"> circuito possui dois estágio de amplificação, sendo o ganho total o produto do ganho de cada estágio. O discriminador se trata basicamente de um comparador </w:t>
+      </w:r>
+      <w:r>
+        <w:rPr>
+          <w:rFonts w:hint="default" w:ascii="Times New Roman" w:hAnsi="Times New Roman"/>
+          <w:sz w:val="24"/>
+          <w:szCs w:val="24"/>
+          <w:lang w:val="pt-BR"/>
+        </w:rPr>
+        <w:t>ADCMP600. Quando o sinal de entrada ultrapassa a tensão de referência (threshold) na porta Vn,  a saída vai para alto, transformando o pulso analógico em um pulso digital.</w:t>
+      </w:r>
+    </w:p>
+    <w:p>
+      <w:pPr>
+        <w:spacing w:line="360" w:lineRule="auto"/>
+        <w:rPr>
+          <w:rFonts w:hint="default" w:ascii="Times New Roman" w:hAnsi="Times New Roman" w:cs="Times New Roman"/>
+          <w:b/>
+          <w:bCs/>
+          <w:sz w:val="36"/>
+          <w:szCs w:val="36"/>
+          <w:lang w:val="pt-BR"/>
+        </w:rPr>
+      </w:pPr>
+      <w:r>
+        <w:rPr>
+          <w:rFonts w:hint="default" w:ascii="Times New Roman" w:hAnsi="Times New Roman"/>
+          <w:sz w:val="24"/>
+          <w:szCs w:val="24"/>
+          <w:lang w:val="pt-BR"/>
+        </w:rPr>
+        <w:tab/>
+      </w:r>
+      <w:r>
+        <w:rPr>
+          <w:rFonts w:hint="default" w:ascii="Times New Roman" w:hAnsi="Times New Roman"/>
+          <w:sz w:val="24"/>
+          <w:szCs w:val="24"/>
+          <w:lang w:val="pt-BR"/>
+        </w:rPr>
+        <w:t>A tensão de referência pode ser gerada por um circuito manual de threshold, que usa um trimpot como divisor de tensão, ou a partir de uma saída de um dos módulos DAC, representada pela tensão DACthDisc no esquemático. A escolha da tensão é feita através da ligação via jumper entre o terminal do header conectado ao discriminador e o terminal com a tensão escolhida.</w:t>
       </w:r>
     </w:p>
     <w:p>

</xml_diff>